<commit_message>
Update Word doc with fixed TOC
</commit_message>
<xml_diff>
--- a/Cybersecurity_Threat_Report_Task1_KaviPriyanT_1.docx
+++ b/Cybersecurity_Threat_Report_Task1_KaviPriyanT_1.docx
@@ -341,25 +341,456 @@
         <w:t xml:space="preserve">Table of Contents</w:t>
       </w:r>
     </w:p>
-    <w:sdt>
-      <w:sdtPr>
-        <w:alias w:val="Table of Contents"/>
-      </w:sdtPr>
-      <w:sdtContent>
-        <w:p>
-          <w:r>
-            <w:fldChar w:fldCharType="begin" w:dirty="true"/>
-            <w:instrText xml:space="preserve">TOC \h \o "1-2"</w:instrText>
-            <w:fldChar w:fldCharType="separate"/>
-          </w:r>
-        </w:p>
-        <w:p>
-          <w:r>
-            <w:fldChar w:fldCharType="end"/>
-          </w:r>
-        </w:p>
-      </w:sdtContent>
-    </w:sdt>
+    <w:p>
+      <w:pPr>
+        <w:tabs>
+          <w:tab w:val="right" w:pos="9350" w:leader="dot"/>
+        </w:tabs>
+        <w:spacing w:after="120"/>
+        <w:ind w:left="0"/>
+      </w:pPr>
+      <w:r>
+        <w:rPr>
+          <w:rFonts w:ascii="Calibri" w:cs="Calibri" w:eastAsia="Calibri" w:hAnsi="Calibri"/>
+          <w:b/>
+          <w:bCs/>
+          <w:color w:val="1F3864"/>
+          <w:sz w:val="22"/>
+          <w:szCs w:val="22"/>
+        </w:rPr>
+        <w:t xml:space="preserve">1. Introduction to Cybersecurity</w:t>
+      </w:r>
+      <w:r>
+        <w:rPr>
+          <w:rFonts w:ascii="Calibri" w:cs="Calibri" w:eastAsia="Calibri" w:hAnsi="Calibri"/>
+          <w:b/>
+          <w:bCs/>
+          <w:sz w:val="22"/>
+          <w:szCs w:val="22"/>
+        </w:rPr>
+        <w:t xml:space="preserve">	3</w:t>
+      </w:r>
+    </w:p>
+    <w:p>
+      <w:pPr>
+        <w:tabs>
+          <w:tab w:val="right" w:pos="9350" w:leader="dot"/>
+        </w:tabs>
+        <w:spacing w:after="80"/>
+        <w:ind w:left="400"/>
+      </w:pPr>
+      <w:r>
+        <w:rPr>
+          <w:rFonts w:ascii="Calibri" w:cs="Calibri" w:eastAsia="Calibri" w:hAnsi="Calibri"/>
+          <w:b w:val="false"/>
+          <w:bCs w:val="false"/>
+          <w:color w:val="000000"/>
+          <w:sz w:val="20"/>
+          <w:szCs w:val="20"/>
+        </w:rPr>
+        <w:t xml:space="preserve">1.1 What is Cybersecurity?</w:t>
+      </w:r>
+      <w:r>
+        <w:rPr>
+          <w:rFonts w:ascii="Calibri" w:cs="Calibri" w:eastAsia="Calibri" w:hAnsi="Calibri"/>
+          <w:b w:val="false"/>
+          <w:bCs w:val="false"/>
+          <w:sz w:val="20"/>
+          <w:szCs w:val="20"/>
+        </w:rPr>
+        <w:t xml:space="preserve">	3</w:t>
+      </w:r>
+    </w:p>
+    <w:p>
+      <w:pPr>
+        <w:tabs>
+          <w:tab w:val="right" w:pos="9350" w:leader="dot"/>
+        </w:tabs>
+        <w:spacing w:after="80"/>
+        <w:ind w:left="400"/>
+      </w:pPr>
+      <w:r>
+        <w:rPr>
+          <w:rFonts w:ascii="Calibri" w:cs="Calibri" w:eastAsia="Calibri" w:hAnsi="Calibri"/>
+          <w:b w:val="false"/>
+          <w:bCs w:val="false"/>
+          <w:color w:val="000000"/>
+          <w:sz w:val="20"/>
+          <w:szCs w:val="20"/>
+        </w:rPr>
+        <w:t xml:space="preserve">1.2 Why is it Important for Individuals and Businesses?</w:t>
+      </w:r>
+      <w:r>
+        <w:rPr>
+          <w:rFonts w:ascii="Calibri" w:cs="Calibri" w:eastAsia="Calibri" w:hAnsi="Calibri"/>
+          <w:b w:val="false"/>
+          <w:bCs w:val="false"/>
+          <w:sz w:val="20"/>
+          <w:szCs w:val="20"/>
+        </w:rPr>
+        <w:t xml:space="preserve">	3</w:t>
+      </w:r>
+    </w:p>
+    <w:p>
+      <w:pPr>
+        <w:tabs>
+          <w:tab w:val="right" w:pos="9350" w:leader="dot"/>
+        </w:tabs>
+        <w:spacing w:after="80"/>
+        <w:ind w:left="400"/>
+      </w:pPr>
+      <w:r>
+        <w:rPr>
+          <w:rFonts w:ascii="Calibri" w:cs="Calibri" w:eastAsia="Calibri" w:hAnsi="Calibri"/>
+          <w:b w:val="false"/>
+          <w:bCs w:val="false"/>
+          <w:color w:val="000000"/>
+          <w:sz w:val="20"/>
+          <w:szCs w:val="20"/>
+        </w:rPr>
+        <w:t xml:space="preserve">1.3 Current Relevance: Cybercrime, Digital Dependency, and AI-Driven Threats</w:t>
+      </w:r>
+      <w:r>
+        <w:rPr>
+          <w:rFonts w:ascii="Calibri" w:cs="Calibri" w:eastAsia="Calibri" w:hAnsi="Calibri"/>
+          <w:b w:val="false"/>
+          <w:bCs w:val="false"/>
+          <w:sz w:val="20"/>
+          <w:szCs w:val="20"/>
+        </w:rPr>
+        <w:t xml:space="preserve">	3</w:t>
+      </w:r>
+    </w:p>
+    <w:p>
+      <w:pPr>
+        <w:tabs>
+          <w:tab w:val="right" w:pos="9350" w:leader="dot"/>
+        </w:tabs>
+        <w:spacing w:after="120"/>
+        <w:ind w:left="0"/>
+      </w:pPr>
+      <w:r>
+        <w:rPr>
+          <w:rFonts w:ascii="Calibri" w:cs="Calibri" w:eastAsia="Calibri" w:hAnsi="Calibri"/>
+          <w:b/>
+          <w:bCs/>
+          <w:color w:val="1F3864"/>
+          <w:sz w:val="22"/>
+          <w:szCs w:val="22"/>
+        </w:rPr>
+        <w:t xml:space="preserve">2–5. Major Modern Cyber Threats: Impact, Case Studies &amp; Defenses</w:t>
+      </w:r>
+      <w:r>
+        <w:rPr>
+          <w:rFonts w:ascii="Calibri" w:cs="Calibri" w:eastAsia="Calibri" w:hAnsi="Calibri"/>
+          <w:b/>
+          <w:bCs/>
+          <w:sz w:val="22"/>
+          <w:szCs w:val="22"/>
+        </w:rPr>
+        <w:t xml:space="preserve">	4</w:t>
+      </w:r>
+    </w:p>
+    <w:p>
+      <w:pPr>
+        <w:tabs>
+          <w:tab w:val="right" w:pos="9350" w:leader="dot"/>
+        </w:tabs>
+        <w:spacing w:after="80"/>
+        <w:ind w:left="400"/>
+      </w:pPr>
+      <w:r>
+        <w:rPr>
+          <w:rFonts w:ascii="Calibri" w:cs="Calibri" w:eastAsia="Calibri" w:hAnsi="Calibri"/>
+          <w:b w:val="false"/>
+          <w:bCs w:val="false"/>
+          <w:color w:val="000000"/>
+          <w:sz w:val="20"/>
+          <w:szCs w:val="20"/>
+        </w:rPr>
+        <w:t xml:space="preserve">2.1 Threat 1: AI-Powered Phishing Attacks</w:t>
+      </w:r>
+      <w:r>
+        <w:rPr>
+          <w:rFonts w:ascii="Calibri" w:cs="Calibri" w:eastAsia="Calibri" w:hAnsi="Calibri"/>
+          <w:b w:val="false"/>
+          <w:bCs w:val="false"/>
+          <w:sz w:val="20"/>
+          <w:szCs w:val="20"/>
+        </w:rPr>
+        <w:t xml:space="preserve">	4</w:t>
+      </w:r>
+    </w:p>
+    <w:p>
+      <w:pPr>
+        <w:tabs>
+          <w:tab w:val="right" w:pos="9350" w:leader="dot"/>
+        </w:tabs>
+        <w:spacing w:after="80"/>
+        <w:ind w:left="400"/>
+      </w:pPr>
+      <w:r>
+        <w:rPr>
+          <w:rFonts w:ascii="Calibri" w:cs="Calibri" w:eastAsia="Calibri" w:hAnsi="Calibri"/>
+          <w:b w:val="false"/>
+          <w:bCs w:val="false"/>
+          <w:color w:val="000000"/>
+          <w:sz w:val="20"/>
+          <w:szCs w:val="20"/>
+        </w:rPr>
+        <w:t xml:space="preserve">2.2 Threat 2: Ransomware-as-a-Service (RaaS)</w:t>
+      </w:r>
+      <w:r>
+        <w:rPr>
+          <w:rFonts w:ascii="Calibri" w:cs="Calibri" w:eastAsia="Calibri" w:hAnsi="Calibri"/>
+          <w:b w:val="false"/>
+          <w:bCs w:val="false"/>
+          <w:sz w:val="20"/>
+          <w:szCs w:val="20"/>
+        </w:rPr>
+        <w:t xml:space="preserve">	4</w:t>
+      </w:r>
+    </w:p>
+    <w:p>
+      <w:pPr>
+        <w:tabs>
+          <w:tab w:val="right" w:pos="9350" w:leader="dot"/>
+        </w:tabs>
+        <w:spacing w:after="80"/>
+        <w:ind w:left="400"/>
+      </w:pPr>
+      <w:r>
+        <w:rPr>
+          <w:rFonts w:ascii="Calibri" w:cs="Calibri" w:eastAsia="Calibri" w:hAnsi="Calibri"/>
+          <w:b w:val="false"/>
+          <w:bCs w:val="false"/>
+          <w:color w:val="000000"/>
+          <w:sz w:val="20"/>
+          <w:szCs w:val="20"/>
+        </w:rPr>
+        <w:t xml:space="preserve">2.3 Threat 3: Cloud Security Misconfigurations</w:t>
+      </w:r>
+      <w:r>
+        <w:rPr>
+          <w:rFonts w:ascii="Calibri" w:cs="Calibri" w:eastAsia="Calibri" w:hAnsi="Calibri"/>
+          <w:b w:val="false"/>
+          <w:bCs w:val="false"/>
+          <w:sz w:val="20"/>
+          <w:szCs w:val="20"/>
+        </w:rPr>
+        <w:t xml:space="preserve">	5</w:t>
+      </w:r>
+    </w:p>
+    <w:p>
+      <w:pPr>
+        <w:tabs>
+          <w:tab w:val="right" w:pos="9350" w:leader="dot"/>
+        </w:tabs>
+        <w:spacing w:after="80"/>
+        <w:ind w:left="400"/>
+      </w:pPr>
+      <w:r>
+        <w:rPr>
+          <w:rFonts w:ascii="Calibri" w:cs="Calibri" w:eastAsia="Calibri" w:hAnsi="Calibri"/>
+          <w:b w:val="false"/>
+          <w:bCs w:val="false"/>
+          <w:color w:val="000000"/>
+          <w:sz w:val="20"/>
+          <w:szCs w:val="20"/>
+        </w:rPr>
+        <w:t xml:space="preserve">2.4 Threat 4: IoT Vulnerabilities</w:t>
+      </w:r>
+      <w:r>
+        <w:rPr>
+          <w:rFonts w:ascii="Calibri" w:cs="Calibri" w:eastAsia="Calibri" w:hAnsi="Calibri"/>
+          <w:b w:val="false"/>
+          <w:bCs w:val="false"/>
+          <w:sz w:val="20"/>
+          <w:szCs w:val="20"/>
+        </w:rPr>
+        <w:t xml:space="preserve">	6</w:t>
+      </w:r>
+    </w:p>
+    <w:p>
+      <w:pPr>
+        <w:tabs>
+          <w:tab w:val="right" w:pos="9350" w:leader="dot"/>
+        </w:tabs>
+        <w:spacing w:after="80"/>
+        <w:ind w:left="400"/>
+      </w:pPr>
+      <w:r>
+        <w:rPr>
+          <w:rFonts w:ascii="Calibri" w:cs="Calibri" w:eastAsia="Calibri" w:hAnsi="Calibri"/>
+          <w:b w:val="false"/>
+          <w:bCs w:val="false"/>
+          <w:color w:val="000000"/>
+          <w:sz w:val="20"/>
+          <w:szCs w:val="20"/>
+        </w:rPr>
+        <w:t xml:space="preserve">2.5 Threat 5: Zero-Day Exploits</w:t>
+      </w:r>
+      <w:r>
+        <w:rPr>
+          <w:rFonts w:ascii="Calibri" w:cs="Calibri" w:eastAsia="Calibri" w:hAnsi="Calibri"/>
+          <w:b w:val="false"/>
+          <w:bCs w:val="false"/>
+          <w:sz w:val="20"/>
+          <w:szCs w:val="20"/>
+        </w:rPr>
+        <w:t xml:space="preserve">	7</w:t>
+      </w:r>
+    </w:p>
+    <w:p>
+      <w:pPr>
+        <w:tabs>
+          <w:tab w:val="right" w:pos="9350" w:leader="dot"/>
+        </w:tabs>
+        <w:spacing w:after="120"/>
+        <w:ind w:left="0"/>
+      </w:pPr>
+      <w:r>
+        <w:rPr>
+          <w:rFonts w:ascii="Calibri" w:cs="Calibri" w:eastAsia="Calibri" w:hAnsi="Calibri"/>
+          <w:b/>
+          <w:bCs/>
+          <w:color w:val="1F3864"/>
+          <w:sz w:val="22"/>
+          <w:szCs w:val="22"/>
+        </w:rPr>
+        <w:t xml:space="preserve">Threat Summary at a Glance</w:t>
+      </w:r>
+      <w:r>
+        <w:rPr>
+          <w:rFonts w:ascii="Calibri" w:cs="Calibri" w:eastAsia="Calibri" w:hAnsi="Calibri"/>
+          <w:b/>
+          <w:bCs/>
+          <w:sz w:val="22"/>
+          <w:szCs w:val="22"/>
+        </w:rPr>
+        <w:t xml:space="preserve">	8</w:t>
+      </w:r>
+    </w:p>
+    <w:p>
+      <w:pPr>
+        <w:tabs>
+          <w:tab w:val="right" w:pos="9350" w:leader="dot"/>
+        </w:tabs>
+        <w:spacing w:after="120"/>
+        <w:ind w:left="0"/>
+      </w:pPr>
+      <w:r>
+        <w:rPr>
+          <w:rFonts w:ascii="Calibri" w:cs="Calibri" w:eastAsia="Calibri" w:hAnsi="Calibri"/>
+          <w:b/>
+          <w:bCs/>
+          <w:color w:val="1F3864"/>
+          <w:sz w:val="22"/>
+          <w:szCs w:val="22"/>
+        </w:rPr>
+        <w:t xml:space="preserve">6. Conclusion &amp; Future Scope</w:t>
+      </w:r>
+      <w:r>
+        <w:rPr>
+          <w:rFonts w:ascii="Calibri" w:cs="Calibri" w:eastAsia="Calibri" w:hAnsi="Calibri"/>
+          <w:b/>
+          <w:bCs/>
+          <w:sz w:val="22"/>
+          <w:szCs w:val="22"/>
+        </w:rPr>
+        <w:t xml:space="preserve">	9</w:t>
+      </w:r>
+    </w:p>
+    <w:p>
+      <w:pPr>
+        <w:tabs>
+          <w:tab w:val="right" w:pos="9350" w:leader="dot"/>
+        </w:tabs>
+        <w:spacing w:after="80"/>
+        <w:ind w:left="400"/>
+      </w:pPr>
+      <w:r>
+        <w:rPr>
+          <w:rFonts w:ascii="Calibri" w:cs="Calibri" w:eastAsia="Calibri" w:hAnsi="Calibri"/>
+          <w:b w:val="false"/>
+          <w:bCs w:val="false"/>
+          <w:color w:val="000000"/>
+          <w:sz w:val="20"/>
+          <w:szCs w:val="20"/>
+        </w:rPr>
+        <w:t xml:space="preserve">6.1 Why Proactive Cybersecurity Matters</w:t>
+      </w:r>
+      <w:r>
+        <w:rPr>
+          <w:rFonts w:ascii="Calibri" w:cs="Calibri" w:eastAsia="Calibri" w:hAnsi="Calibri"/>
+          <w:b w:val="false"/>
+          <w:bCs w:val="false"/>
+          <w:sz w:val="20"/>
+          <w:szCs w:val="20"/>
+        </w:rPr>
+        <w:t xml:space="preserve">	9</w:t>
+      </w:r>
+    </w:p>
+    <w:p>
+      <w:pPr>
+        <w:tabs>
+          <w:tab w:val="right" w:pos="9350" w:leader="dot"/>
+        </w:tabs>
+        <w:spacing w:after="80"/>
+        <w:ind w:left="400"/>
+      </w:pPr>
+      <w:r>
+        <w:rPr>
+          <w:rFonts w:ascii="Calibri" w:cs="Calibri" w:eastAsia="Calibri" w:hAnsi="Calibri"/>
+          <w:b w:val="false"/>
+          <w:bCs w:val="false"/>
+          <w:color w:val="000000"/>
+          <w:sz w:val="20"/>
+          <w:szCs w:val="20"/>
+        </w:rPr>
+        <w:t xml:space="preserve">6.2 The Need for Continuous Learning</w:t>
+      </w:r>
+      <w:r>
+        <w:rPr>
+          <w:rFonts w:ascii="Calibri" w:cs="Calibri" w:eastAsia="Calibri" w:hAnsi="Calibri"/>
+          <w:b w:val="false"/>
+          <w:bCs w:val="false"/>
+          <w:sz w:val="20"/>
+          <w:szCs w:val="20"/>
+        </w:rPr>
+        <w:t xml:space="preserve">	9</w:t>
+      </w:r>
+    </w:p>
+    <w:p>
+      <w:pPr>
+        <w:tabs>
+          <w:tab w:val="right" w:pos="9350" w:leader="dot"/>
+        </w:tabs>
+        <w:spacing w:after="120"/>
+        <w:ind w:left="0"/>
+      </w:pPr>
+      <w:r>
+        <w:rPr>
+          <w:rFonts w:ascii="Calibri" w:cs="Calibri" w:eastAsia="Calibri" w:hAnsi="Calibri"/>
+          <w:b/>
+          <w:bCs/>
+          <w:color w:val="1F3864"/>
+          <w:sz w:val="22"/>
+          <w:szCs w:val="22"/>
+        </w:rPr>
+        <w:t xml:space="preserve">References</w:t>
+      </w:r>
+      <w:r>
+        <w:rPr>
+          <w:rFonts w:ascii="Calibri" w:cs="Calibri" w:eastAsia="Calibri" w:hAnsi="Calibri"/>
+          <w:b/>
+          <w:bCs/>
+          <w:sz w:val="22"/>
+          <w:szCs w:val="22"/>
+        </w:rPr>
+        <w:t xml:space="preserve">	10</w:t>
+      </w:r>
+    </w:p>
     <w:p>
       <w:pPr>
         <w:sectPr>

</xml_diff>